<commit_message>
pages: commit current MDPI IoT DOCX at root (railway-free abstract; MDPI_1.7 styled)
Co-Authored-By: Claude Opus 4.8 <noreply@anthropic.com>
</commit_message>
<xml_diff>
--- a/paper_mdpi.docx
+++ b/paper_mdpi.docx
@@ -232,27 +232,10 @@
     </w:p>
     <w:p>
       <w:pPr>
-        <w:pStyle w:val="MDPI18keywords"/>
-        <w:ind w:left="2608"/>
-      </w:pPr>
-      <w:r>
-        <w:t xml:space="preserve">Faults on a networked cyber-physical system (CPS), the sensing-and-actuation core of an industrial Internet-of-Things (IoT) deployment, are too rare and unrepresentative to characterise or to select a model on, so detection must instead</w:t>
-      </w:r>
-      <w:r>
-        <w:t xml:space="preserve"> </w:t>
-      </w:r>
-      <w:r>
-        <w:rPr>
-          <w:i/>
-          <w:iCs/>
-        </w:rPr>
-        <w:t xml:space="preserve">model normal</w:t>
-      </w:r>
-      <w:r>
-        <w:t xml:space="preserve"> </w:t>
-      </w:r>
-      <w:r>
-        <w:t xml:space="preserve">behaviour; the standard point-adjusted evaluation, however, rewards detectors that never do. CPS normal behaviour is the union of many imbalanced, curved, thin-fringed operating regimes rather than a single blob, a structure we state as ten assumptions (A1–A10) abbreviated</w:t>
+        <w:pStyle w:val="MDPI17abstract"/>
+      </w:pPr>
+      <w:r>
+        <w:t xml:space="preserve">Fault detection in networked cyber-physical systems (CPS), which form the sensing and actuation layer of industrial Internet-of-Things deployments, is difficult because faults are rare and poorly represented in available data. Detection must therefore rely on models of normal behaviour rather than representative fault examples. However, existing AI methods often fail because they ignore the unique structure of CPS, where stochastic behaviour is constrained by physical laws, engineered control logic, and numerous operating regimes. More generally, normal CPS behaviour is not a single distribution, but a union of many imbalanced, curved, and sparsely populated regimes. We formalize this structure through ten assumptions, A1–A10, summarized as</w:t>
       </w:r>
       <w:r>
         <w:t xml:space="preserve"> </w:t>
@@ -268,20 +251,7 @@
         <w:t xml:space="preserve"> </w:t>
       </w:r>
       <w:r>
-        <w:t xml:space="preserve">(MIIM). We model the normal law with a jointly learned latent plus explicit Gaussian-mixture mode clustering, scored in the latent rather than by a global density or a reconstruction residual, and evaluate under a fair protocol: raw point-wise metrics, a trivial-detector difficulty split, prevalence-matched F1, and train-normal-only calibration. On three real CPS datasets (WADI, HAI, SKAB) the detector</w:t>
-      </w:r>
-      <w:r>
-        <w:t xml:space="preserve"> </w:t>
-      </w:r>
-      <w:r>
-        <w:rPr>
-          <w:b/>
-          <w:bCs/>
-        </w:rPr>
-        <w:t xml:space="preserve">wins both the combined and the difficult column on all three</w:t>
-      </w:r>
-      <w:r>
-        <w:t xml:space="preserve">, reaching difficult-subset AUROC 0.831 on HAI, 0.726 on WADI and 0.610 on SKAB. The margin is largest on the two multimodal datasets the assumptions target and slimmest on the near-unimodal one, and it holds against three deep detectors (USAD, TranAD, GDN) re-scored with the same raw metrics. The contributions are the MIIM assumption set, the difficulty-stratified protocol, and a latent-only score that drops reconstruction because a flexible decoder rebuilds the hard faults faithfully.</w:t>
+        <w:t xml:space="preserve">(MIIM). Based on these assumptions, we jointly learn a latent representation and a Gaussian-mixture clustering of operating modes. Anomaly scores are computed directly in latent space rather than from a density estimate or reconstruction error. We evaluate the method using raw point-wise metrics, a split between easy and difficult cases defined by a trivial detector, prevalence-matched F1, and calibration using normal training data. Across WADI, HAI, and SKAB, the method performs best overall and on difficult subsets, achieving AUROC values of 0.831, 0.726, and 0.610, respectively. Gains are strongest on multimodal datasets and remain consistent against USAD, TranAD, and GDN. The contributions are the MIIM assumptions, the difficulty-stratified protocol, and a latent-only anomaly score.</w:t>
       </w:r>
     </w:p>
     <w:p>
@@ -314,7 +284,7 @@
     </w:p>
     <w:p>
       <w:pPr>
-        <w:pStyle w:val="MDPI18keywords"/>
+        <w:pStyle w:val="MDPI32textnoindent"/>
         <w:ind w:left="2608"/>
       </w:pPr>
       <w:r>
@@ -334,7 +304,7 @@
     </w:p>
     <w:p>
       <w:pPr>
-        <w:pStyle w:val="MDPI18keywords"/>
+        <w:pStyle w:val="MDPI31text"/>
         <w:ind w:left="2608"/>
       </w:pPr>
       <w:r>
@@ -354,7 +324,7 @@
     </w:p>
     <w:p>
       <w:pPr>
-        <w:pStyle w:val="MDPI18keywords"/>
+        <w:pStyle w:val="MDPI31text"/>
         <w:ind w:left="2608"/>
       </w:pPr>
       <w:r>
@@ -379,7 +349,7 @@
     </w:p>
     <w:p>
       <w:pPr>
-        <w:pStyle w:val="MDPI18keywords"/>
+        <w:pStyle w:val="MDPI31text"/>
         <w:ind w:left="2608"/>
       </w:pPr>
       <w:r>
@@ -482,7 +452,7 @@
     </w:p>
     <w:p>
       <w:pPr>
-        <w:pStyle w:val="MDPI18keywords"/>
+        <w:pStyle w:val="MDPI31text"/>
         <w:ind w:left="2608"/>
       </w:pPr>
       <w:r>
@@ -639,7 +609,7 @@
     </w:p>
     <w:p>
       <w:pPr>
-        <w:pStyle w:val="MDPI18keywords"/>
+        <w:pStyle w:val="MDPI31text"/>
         <w:ind w:left="2608"/>
       </w:pPr>
       <w:r>
@@ -669,7 +639,7 @@
     </w:p>
     <w:p>
       <w:pPr>
-        <w:pStyle w:val="MDPI18keywords"/>
+        <w:pStyle w:val="MDPI32textnoindent"/>
         <w:ind w:left="2608"/>
       </w:pPr>
       <w:r>
@@ -742,7 +712,7 @@
     </w:p>
     <w:p>
       <w:pPr>
-        <w:pStyle w:val="MDPI18keywords"/>
+        <w:pStyle w:val="MDPI32textnoindent"/>
         <w:ind w:left="2608"/>
       </w:pPr>
       <w:r>
@@ -910,7 +880,7 @@
     </w:p>
     <w:p>
       <w:pPr>
-        <w:pStyle w:val="MDPI18keywords"/>
+        <w:pStyle w:val="MDPI31text"/>
         <w:ind w:left="2608"/>
       </w:pPr>
       <w:r>
@@ -963,7 +933,7 @@
     </w:p>
     <w:p>
       <w:pPr>
-        <w:pStyle w:val="MDPI18keywords"/>
+        <w:pStyle w:val="MDPI31text"/>
         <w:ind w:left="2608"/>
       </w:pPr>
       <w:r>
@@ -1021,7 +991,7 @@
     </w:p>
     <w:p>
       <w:pPr>
-        <w:pStyle w:val="MDPI18keywords"/>
+        <w:pStyle w:val="MDPI32textnoindent"/>
         <w:ind w:left="2608"/>
       </w:pPr>
       <w:r>
@@ -1124,7 +1094,7 @@
     </w:p>
     <w:p>
       <w:pPr>
-        <w:pStyle w:val="MDPI18keywords"/>
+        <w:pStyle w:val="MDPI32textnoindent"/>
         <w:ind w:left="2608"/>
       </w:pPr>
       <w:r>
@@ -1193,7 +1163,7 @@
     </w:p>
     <w:p>
       <w:pPr>
-        <w:pStyle w:val="MDPI18keywords"/>
+        <w:pStyle w:val="MDPI32textnoindent"/>
         <w:ind w:left="2608"/>
       </w:pPr>
       <w:r>
@@ -1277,7 +1247,7 @@
     </w:p>
     <w:p>
       <w:pPr>
-        <w:pStyle w:val="MDPI18keywords"/>
+        <w:pStyle w:val="MDPI32textnoindent"/>
         <w:ind w:left="2608"/>
       </w:pPr>
       <w:r>
@@ -2718,7 +2688,7 @@
     </w:tbl>
     <w:p>
       <w:pPr>
-        <w:pStyle w:val="MDPI18keywords"/>
+        <w:pStyle w:val="MDPI31text"/>
         <w:ind w:left="2608"/>
       </w:pPr>
       <w:r>
@@ -2831,7 +2801,7 @@
     </w:p>
     <w:p>
       <w:pPr>
-        <w:pStyle w:val="MDPI18keywords"/>
+        <w:pStyle w:val="MDPI32textnoindent"/>
         <w:ind w:left="2608"/>
       </w:pPr>
       <w:r>
@@ -2865,7 +2835,7 @@
     </w:p>
     <w:p>
       <w:pPr>
-        <w:pStyle w:val="MDPI18keywords"/>
+        <w:pStyle w:val="MDPI31text"/>
         <w:ind w:left="2608"/>
       </w:pPr>
       <w:r>
@@ -2948,7 +2918,7 @@
     </w:p>
     <w:p>
       <w:pPr>
-        <w:pStyle w:val="MDPI18keywords"/>
+        <w:pStyle w:val="MDPI32textnoindent"/>
         <w:ind w:left="2608"/>
       </w:pPr>
       <w:r>
@@ -3271,7 +3241,7 @@
     </w:p>
     <w:p>
       <w:pPr>
-        <w:pStyle w:val="MDPI18keywords"/>
+        <w:pStyle w:val="MDPI32textnoindent"/>
         <w:ind w:left="2608"/>
       </w:pPr>
       <w:r>
@@ -3673,7 +3643,7 @@
     </w:p>
     <w:p>
       <w:pPr>
-        <w:pStyle w:val="MDPI18keywords"/>
+        <w:pStyle w:val="MDPI32textnoindent"/>
         <w:ind w:left="2608"/>
       </w:pPr>
       <w:r>
@@ -3919,7 +3889,7 @@
     </w:p>
     <w:p>
       <w:pPr>
-        <w:pStyle w:val="MDPI18keywords"/>
+        <w:pStyle w:val="MDPI32textnoindent"/>
         <w:ind w:left="2608"/>
       </w:pPr>
       <w:r>
@@ -4439,7 +4409,7 @@
     </w:tbl>
     <w:p>
       <w:pPr>
-        <w:pStyle w:val="MDPI18keywords"/>
+        <w:pStyle w:val="MDPI31text"/>
         <w:ind w:left="2608"/>
       </w:pPr>
       <w:r>
@@ -4488,7 +4458,7 @@
     </w:p>
     <w:p>
       <w:pPr>
-        <w:pStyle w:val="MDPI18keywords"/>
+        <w:pStyle w:val="MDPI32textnoindent"/>
         <w:ind w:left="2608"/>
       </w:pPr>
       <w:r>
@@ -4556,7 +4526,7 @@
     </w:p>
     <w:p>
       <w:pPr>
-        <w:pStyle w:val="MDPI18keywords"/>
+        <w:pStyle w:val="MDPI32textnoindent"/>
         <w:ind w:left="2608"/>
       </w:pPr>
       <w:r>
@@ -4800,7 +4770,7 @@
     </w:p>
     <w:p>
       <w:pPr>
-        <w:pStyle w:val="MDPI18keywords"/>
+        <w:pStyle w:val="MDPI32textnoindent"/>
         <w:ind w:left="2608"/>
       </w:pPr>
       <w:r>
@@ -4997,7 +4967,7 @@
     </w:p>
     <w:p>
       <w:pPr>
-        <w:pStyle w:val="MDPI18keywords"/>
+        <w:pStyle w:val="MDPI32textnoindent"/>
         <w:ind w:left="2608"/>
       </w:pPr>
       <w:r>
@@ -5129,7 +5099,7 @@
     </w:p>
     <w:p>
       <w:pPr>
-        <w:pStyle w:val="MDPI18keywords"/>
+        <w:pStyle w:val="MDPI32textnoindent"/>
         <w:ind w:left="2608"/>
       </w:pPr>
       <w:r>
@@ -5369,7 +5339,7 @@
     </w:p>
     <w:p>
       <w:pPr>
-        <w:pStyle w:val="MDPI18keywords"/>
+        <w:pStyle w:val="MDPI32textnoindent"/>
         <w:ind w:left="2608"/>
       </w:pPr>
       <w:r>
@@ -5498,7 +5468,7 @@
     </w:p>
     <w:p>
       <w:pPr>
-        <w:pStyle w:val="MDPI18keywords"/>
+        <w:pStyle w:val="MDPI32textnoindent"/>
         <w:ind w:left="2608"/>
       </w:pPr>
       <w:r>
@@ -5757,7 +5727,7 @@
     </w:p>
     <w:p>
       <w:pPr>
-        <w:pStyle w:val="MDPI18keywords"/>
+        <w:pStyle w:val="MDPI32textnoindent"/>
         <w:ind w:left="2608"/>
       </w:pPr>
       <w:r>
@@ -5870,7 +5840,7 @@
     </w:p>
     <w:p>
       <w:pPr>
-        <w:pStyle w:val="MDPI18keywords"/>
+        <w:pStyle w:val="MDPI31text"/>
         <w:ind w:left="2608"/>
       </w:pPr>
       <w:r>
@@ -5925,7 +5895,7 @@
     </w:p>
     <w:p>
       <w:pPr>
-        <w:pStyle w:val="MDPI18keywords"/>
+        <w:pStyle w:val="MDPI32textnoindent"/>
         <w:ind w:left="2608"/>
       </w:pPr>
       <w:r>
@@ -5934,7 +5904,12 @@
     </w:p>
     <w:p>
       <w:pPr>
-        <w:pStyle w:val="Compact"/>
+        <w:pStyle w:val="MDPI38bullet"/>
+        <w:numPr>
+          <w:ilvl w:val="0"/>
+          <w:numId w:val="2"/>
+        </w:numPr>
+        <w:ind w:left="3328" w:hanging="360"/>
       </w:pPr>
       <w:r>
         <w:rPr>
@@ -6006,7 +5981,12 @@
     </w:p>
     <w:p>
       <w:pPr>
-        <w:pStyle w:val="Compact"/>
+        <w:pStyle w:val="MDPI38bullet"/>
+        <w:numPr>
+          <w:ilvl w:val="0"/>
+          <w:numId w:val="2"/>
+        </w:numPr>
+        <w:ind w:left="3328" w:hanging="360"/>
       </w:pPr>
       <w:r>
         <w:rPr>
@@ -6047,7 +6027,12 @@
     </w:p>
     <w:p>
       <w:pPr>
-        <w:pStyle w:val="Compact"/>
+        <w:pStyle w:val="MDPI38bullet"/>
+        <w:numPr>
+          <w:ilvl w:val="0"/>
+          <w:numId w:val="2"/>
+        </w:numPr>
+        <w:ind w:left="3328" w:hanging="360"/>
       </w:pPr>
       <w:r>
         <w:rPr>
@@ -6097,7 +6082,7 @@
     </w:p>
     <w:p>
       <w:pPr>
-        <w:pStyle w:val="MDPI18keywords"/>
+        <w:pStyle w:val="MDPI32textnoindent"/>
         <w:ind w:left="2608"/>
       </w:pPr>
       <w:r>
@@ -6274,7 +6259,7 @@
     </w:p>
     <w:p>
       <w:pPr>
-        <w:pStyle w:val="MDPI18keywords"/>
+        <w:pStyle w:val="MDPI32textnoindent"/>
         <w:ind w:left="2608"/>
       </w:pPr>
       <w:r>
@@ -6428,7 +6413,7 @@
     </w:p>
     <w:p>
       <w:pPr>
-        <w:pStyle w:val="MDPI18keywords"/>
+        <w:pStyle w:val="MDPI32textnoindent"/>
         <w:ind w:left="2608"/>
       </w:pPr>
       <w:r>
@@ -6437,7 +6422,12 @@
     </w:p>
     <w:p>
       <w:pPr>
-        <w:pStyle w:val="Compact"/>
+        <w:pStyle w:val="MDPI38bullet"/>
+        <w:numPr>
+          <w:ilvl w:val="0"/>
+          <w:numId w:val="2"/>
+        </w:numPr>
+        <w:ind w:left="3328" w:hanging="360"/>
       </w:pPr>
       <w:r>
         <w:rPr>
@@ -6461,7 +6451,12 @@
     </w:p>
     <w:p>
       <w:pPr>
-        <w:pStyle w:val="Compact"/>
+        <w:pStyle w:val="MDPI38bullet"/>
+        <w:numPr>
+          <w:ilvl w:val="0"/>
+          <w:numId w:val="2"/>
+        </w:numPr>
+        <w:ind w:left="3328" w:hanging="360"/>
       </w:pPr>
       <w:r>
         <w:rPr>
@@ -6513,7 +6508,12 @@
     </w:p>
     <w:p>
       <w:pPr>
-        <w:pStyle w:val="Compact"/>
+        <w:pStyle w:val="MDPI38bullet"/>
+        <w:numPr>
+          <w:ilvl w:val="0"/>
+          <w:numId w:val="2"/>
+        </w:numPr>
+        <w:ind w:left="3328" w:hanging="360"/>
       </w:pPr>
       <w:r>
         <w:rPr>
@@ -6531,7 +6531,7 @@
     </w:p>
     <w:p>
       <w:pPr>
-        <w:pStyle w:val="MDPI18keywords"/>
+        <w:pStyle w:val="MDPI32textnoindent"/>
         <w:ind w:left="2608"/>
       </w:pPr>
       <w:r>
@@ -6567,7 +6567,7 @@
     </w:p>
     <w:p>
       <w:pPr>
-        <w:pStyle w:val="MDPI18keywords"/>
+        <w:pStyle w:val="MDPI32textnoindent"/>
         <w:ind w:left="2608"/>
       </w:pPr>
       <w:r>
@@ -6740,7 +6740,7 @@
     </w:p>
     <w:p>
       <w:pPr>
-        <w:pStyle w:val="MDPI18keywords"/>
+        <w:pStyle w:val="MDPI32textnoindent"/>
         <w:ind w:left="2608"/>
       </w:pPr>
       <w:r>
@@ -12431,7 +12431,7 @@
     </w:tbl>
     <w:p>
       <w:pPr>
-        <w:pStyle w:val="MDPI18keywords"/>
+        <w:pStyle w:val="MDPI31text"/>
         <w:ind w:left="2608"/>
       </w:pPr>
       <w:r>
@@ -12474,7 +12474,7 @@
     </w:p>
     <w:p>
       <w:pPr>
-        <w:pStyle w:val="MDPI18keywords"/>
+        <w:pStyle w:val="MDPI31text"/>
         <w:ind w:left="2608"/>
       </w:pPr>
       <w:r>
@@ -12529,7 +12529,7 @@
     </w:p>
     <w:p>
       <w:pPr>
-        <w:pStyle w:val="MDPI18keywords"/>
+        <w:pStyle w:val="MDPI31text"/>
         <w:ind w:left="2608"/>
       </w:pPr>
       <w:r>
@@ -12572,7 +12572,7 @@
     </w:p>
     <w:p>
       <w:pPr>
-        <w:pStyle w:val="MDPI18keywords"/>
+        <w:pStyle w:val="MDPI31text"/>
         <w:ind w:left="2608"/>
       </w:pPr>
       <w:r>
@@ -12609,7 +12609,7 @@
     </w:p>
     <w:p>
       <w:pPr>
-        <w:pStyle w:val="MDPI18keywords"/>
+        <w:pStyle w:val="MDPI31text"/>
         <w:ind w:left="2608"/>
       </w:pPr>
       <w:r>
@@ -12753,7 +12753,7 @@
     </w:p>
     <w:p>
       <w:pPr>
-        <w:pStyle w:val="MDPI18keywords"/>
+        <w:pStyle w:val="MDPI32textnoindent"/>
         <w:ind w:left="2608"/>
       </w:pPr>
       <w:r>
@@ -12841,7 +12841,7 @@
     </w:p>
     <w:p>
       <w:pPr>
-        <w:pStyle w:val="MDPI18keywords"/>
+        <w:pStyle w:val="MDPI31text"/>
         <w:ind w:left="2608"/>
       </w:pPr>
       <w:r>
@@ -12922,7 +12922,7 @@
     </w:p>
     <w:p>
       <w:pPr>
-        <w:pStyle w:val="MDPI18keywords"/>
+        <w:pStyle w:val="MDPI31text"/>
         <w:ind w:left="2608"/>
       </w:pPr>
       <w:r>
@@ -12971,7 +12971,7 @@
     </w:p>
     <w:p>
       <w:pPr>
-        <w:pStyle w:val="MDPI18keywords"/>
+        <w:pStyle w:val="MDPI31text"/>
         <w:ind w:left="2608"/>
       </w:pPr>
       <w:r>
@@ -13026,7 +13026,7 @@
     </w:p>
     <w:p>
       <w:pPr>
-        <w:pStyle w:val="MDPI18keywords"/>
+        <w:pStyle w:val="MDPI31text"/>
         <w:ind w:left="2608"/>
       </w:pPr>
       <w:r>
@@ -13087,7 +13087,7 @@
     </w:p>
     <w:p>
       <w:pPr>
-        <w:pStyle w:val="MDPI18keywords"/>
+        <w:pStyle w:val="MDPI31text"/>
         <w:ind w:left="2608"/>
       </w:pPr>
       <w:r>
@@ -13130,7 +13130,7 @@
     </w:p>
     <w:p>
       <w:pPr>
-        <w:pStyle w:val="MDPI18keywords"/>
+        <w:pStyle w:val="MDPI31text"/>
         <w:ind w:left="2608"/>
       </w:pPr>
       <w:r>
@@ -13200,7 +13200,7 @@
     </w:p>
     <w:p>
       <w:pPr>
-        <w:pStyle w:val="MDPI18keywords"/>
+        <w:pStyle w:val="MDPI32textnoindent"/>
         <w:ind w:left="2608"/>
       </w:pPr>
       <w:r>
@@ -13401,7 +13401,7 @@
     </w:p>
     <w:p>
       <w:pPr>
-        <w:pStyle w:val="MDPI18keywords"/>
+        <w:pStyle w:val="MDPI31text"/>
         <w:ind w:left="2608"/>
       </w:pPr>
       <w:r>

</xml_diff>

<commit_message>
paper(IoT): Yehudit Aperstein as corresponding author (Apartsin remains first author)
- Manuscript author block: move * and correspondence email to Aperstein (apersteiny@afeka.ac.il)
- IoT template front matter + both DOCX rebuilt; cover letter (HTML+DOCX) authorship line updated
- Apartsin stays first author, so the feature-paper fee waiver still applies
- resync root index.html + paper_mdpi.docx for Pages

Co-Authored-By: Claude Opus 4.8 <noreply@anthropic.com>
</commit_message>
<xml_diff>
--- a/paper_mdpi.docx
+++ b/paper_mdpi.docx
@@ -29,7 +29,7 @@
         <w:rPr>
           <w:vertAlign w:val="superscript"/>
         </w:rPr>
-        <w:t>1,*</w:t>
+        <w:t>1</w:t>
       </w:r>
       <w:r>
         <w:rPr/>
@@ -39,7 +39,7 @@
         <w:rPr>
           <w:vertAlign w:val="superscript"/>
         </w:rPr>
-        <w:t>2</w:t>
+        <w:t>2,*</w:t>
       </w:r>
     </w:p>
     <w:tbl>
@@ -212,7 +212,7 @@
       </w:r>
       <w:r>
         <w:tab/>
-        <w:t>Correspondence: alexanderap@hit.ac.il</w:t>
+        <w:t>Correspondence: apersteiny@afeka.ac.il</w:t>
       </w:r>
     </w:p>
     <w:p>

</xml_diff>

<commit_message>
paper: rebuild MDPI DOCX cleanly from paper.html (html2doc now rasterizes inline SVG); drop manual workaround
Co-Authored-By: Claude Opus 4.8 <noreply@anthropic.com>
</commit_message>
<xml_diff>
--- a/paper_mdpi.docx
+++ b/paper_mdpi.docx
@@ -10690,20 +10690,20 @@
       <w:r>
         <w:drawing>
           <wp:inline>
-            <wp:extent cx="4989830" cy="2079095"/>
+            <wp:extent cx="4989830" cy="2080135"/>
             <wp:effectExtent b="0" l="0" r="0" t="0"/>
-            <wp:docPr descr="Difficult-subset AUROC by method" title="" id="32" name="Picture"/>
+            <wp:docPr descr="figure" title="" id="32" name="Picture"/>
             <a:graphic>
               <a:graphicData uri="http://schemas.openxmlformats.org/drawingml/2006/picture">
                 <pic:pic>
                   <pic:nvPicPr>
-                    <pic:cNvPr descr="figures/fig1.png" id="33" name="Picture"/>
+                    <pic:cNvPr descr="_inlinesvg_0.png" id="33" name="Picture"/>
                     <pic:cNvPicPr>
                       <a:picLocks noChangeArrowheads="1" noChangeAspect="1"/>
                     </pic:cNvPicPr>
                   </pic:nvPicPr>
                   <pic:blipFill>
-                    <a:blip r:embed="rId46"/>
+                    <a:blip r:embed="rId51"/>
                     <a:stretch>
                       <a:fillRect/>
                     </a:stretch>
@@ -10711,7 +10711,7 @@
                   <pic:spPr bwMode="auto">
                     <a:xfrm>
                       <a:off x="0" y="0"/>
-                      <a:ext cx="4989830" cy="2079095"/>
+                      <a:ext cx="4989830" cy="2080135"/>
                     </a:xfrm>
                     <a:prstGeom prst="rect">
                       <a:avLst/>

</xml_diff>

<commit_message>
paper: fix stale intro (drop GDN, HAI-lead reframe, five-seed); rebuild DOCX. Caught via PDF visual QA
</commit_message>
<xml_diff>
--- a/paper_mdpi.docx
+++ b/paper_mdpi.docx
@@ -586,25 +586,25 @@
         <w:t xml:space="preserve"> </w:t>
       </w:r>
       <w:r>
-        <w:t xml:space="preserve">three real CPS datasets, and compare against classical baselines and against three deep detectors, USAD,</w:t>
-      </w:r>
-      <w:r>
-        <w:t xml:space="preserve"> </w:t>
-      </w:r>
-      <w:r>
-        <w:t xml:space="preserve">TranAD and GDN, re-computed with the same raw metrics (§5–6). The detector wins the combined</w:t>
-      </w:r>
-      <w:r>
-        <w:t xml:space="preserve"> </w:t>
-      </w:r>
-      <w:r>
-        <w:t xml:space="preserve">column and the difficult column on all three datasets, with the largest margins precisely where the MIIM</w:t>
-      </w:r>
-      <w:r>
-        <w:t xml:space="preserve"> </w:t>
-      </w:r>
-      <w:r>
-        <w:t xml:space="preserve">structure is strongest and the slimmest on the one near-unimodal set.</w:t>
+        <w:t xml:space="preserve">three real CPS attack benchmarks, and compare against classical baselines and against two deep detectors, USAD</w:t>
+      </w:r>
+      <w:r>
+        <w:t xml:space="preserve"> </w:t>
+      </w:r>
+      <w:r>
+        <w:t xml:space="preserve">and TranAD, re-computed with the same raw metrics (§5–6). The detector attains the best overall AUROC</w:t>
+      </w:r>
+      <w:r>
+        <w:t xml:space="preserve"> </w:t>
+      </w:r>
+      <w:r>
+        <w:t xml:space="preserve">on every dataset and leads the difficult column over five seeds, most decisively on HAI, where the difficult</w:t>
+      </w:r>
+      <w:r>
+        <w:t xml:space="preserve"> </w:t>
+      </w:r>
+      <w:r>
+        <w:t xml:space="preserve">faults break joint structure and the deep detectors collapse.</w:t>
       </w:r>
     </w:p>
     <w:p>
@@ -619,7 +619,7 @@
         <w:t xml:space="preserve"> </w:t>
       </w:r>
       <w:r>
-        <w:t xml:space="preserve">per dataset; several results are single-seed and the best-F1 threshold is an oracle (disclosed in §5). We</w:t>
+        <w:t xml:space="preserve">per dataset; AUROC is reported as a five-seed mean and the best-F1 threshold is an oracle (disclosed in §5). We</w:t>
       </w:r>
       <w:r>
         <w:t xml:space="preserve"> </w:t>

</xml_diff>